<commit_message>
Revisione Pattern: Abstract Factory Method, aggiunta UML corretto, dettagli codice e documentazione
</commit_message>
<xml_diff>
--- a/designPattern/AbstractFactory/Documentazione Abstract Factory.docx
+++ b/designPattern/AbstractFactory/Documentazione Abstract Factory.docx
@@ -16,19 +16,28 @@
           <w:sz w:val="32"/>
           <w:szCs w:val="32"/>
         </w:rPr>
-        <w:t xml:space="preserve">Documentazione Abstract </w:t>
-      </w:r>
-      <w:proofErr w:type="spellStart"/>
+        <w:t>Documentazione Abstract Factory</w:t>
+      </w:r>
+    </w:p>
+    <w:p>
       <w:r>
         <w:rPr>
           <w:b/>
           <w:bCs/>
-          <w:sz w:val="32"/>
-          <w:szCs w:val="32"/>
-        </w:rPr>
-        <w:t>Factory</w:t>
-      </w:r>
-      <w:proofErr w:type="spellEnd"/>
+        </w:rPr>
+        <w:t>Obiettivo del pattern</w:t>
+      </w:r>
+    </w:p>
+    <w:p>
+      <w:r>
+        <w:t xml:space="preserve">L’Abstract Factory serve a creare famiglie di oggetti compatibili tra loro senza far conoscere al client le classi concrete. </w:t>
+      </w:r>
+      <w:r>
+        <w:t xml:space="preserve">In questo </w:t>
+      </w:r>
+      <w:r>
+        <w:t>esempio, la factory crea una coppia coerente di oggetti: una Notifica e un TemplateMessaggio.</w:t>
+      </w:r>
     </w:p>
     <w:p>
       <w:r>
@@ -36,131 +45,132 @@
           <w:b/>
           <w:bCs/>
         </w:rPr>
-        <w:t>Obiettivo del pattern</w:t>
-      </w:r>
-    </w:p>
-    <w:p>
-      <w:r>
-        <w:t xml:space="preserve">L’Abstract </w:t>
-      </w:r>
-      <w:proofErr w:type="spellStart"/>
-      <w:r>
-        <w:t>Factory</w:t>
-      </w:r>
-      <w:proofErr w:type="spellEnd"/>
-      <w:r>
-        <w:t xml:space="preserve"> serve a creare famiglie di oggetti compatibili tra loro senza far conoscere al client le classi concrete. </w:t>
-      </w:r>
-      <w:r>
-        <w:t xml:space="preserve">In questo </w:t>
-      </w:r>
-      <w:r>
-        <w:t xml:space="preserve">esempio, la </w:t>
-      </w:r>
-      <w:proofErr w:type="spellStart"/>
-      <w:r>
-        <w:t>factory</w:t>
-      </w:r>
-      <w:proofErr w:type="spellEnd"/>
-      <w:r>
-        <w:t xml:space="preserve"> crea una coppia coerente di oggetti: una Notifica e un </w:t>
-      </w:r>
-      <w:proofErr w:type="spellStart"/>
-      <w:r>
-        <w:t>TemplateMessaggio</w:t>
-      </w:r>
-      <w:proofErr w:type="spellEnd"/>
-      <w:r>
-        <w:t>.</w:t>
-      </w:r>
-    </w:p>
-    <w:p>
-      <w:r>
+        <w:t>Idea generale</w:t>
+      </w:r>
+    </w:p>
+    <w:p>
+      <w:r>
+        <w:t>Il client non deve istanziare direttamente le classi concrete con new. Chiede invece alla factory della famiglia desiderata di costruire i prodotti giusti. In questo modo si evita di mischiare oggetti appartenenti a famiglie diverse.</w:t>
+      </w:r>
+    </w:p>
+    <w:p>
+      <w:pPr>
         <w:rPr>
           <w:b/>
           <w:bCs/>
         </w:rPr>
-        <w:t>Idea generale</w:t>
-      </w:r>
-    </w:p>
-    <w:p>
-      <w:r>
-        <w:t xml:space="preserve">Il client non deve istanziare direttamente le classi concrete con new. Chiede invece alla </w:t>
-      </w:r>
-      <w:proofErr w:type="spellStart"/>
-      <w:r>
-        <w:t>factory</w:t>
-      </w:r>
-      <w:proofErr w:type="spellEnd"/>
-      <w:r>
-        <w:t xml:space="preserve"> della famiglia desiderata di costruire i prodotti giusti. In questo modo si evita di mischiare oggetti appartenenti a famiglie diverse.</w:t>
-      </w:r>
-    </w:p>
-    <w:p>
-      <w:pPr>
+      </w:pPr>
+      <w:r>
         <w:rPr>
           <w:b/>
           <w:bCs/>
         </w:rPr>
+        <w:t>Implementazione</w:t>
+      </w:r>
+    </w:p>
+    <w:p>
+      <w:r>
+        <w:t>Il codice è strutturato con due interfacce prodotto, due coppie di classi concrete e una factory astratta con due implementazioni concrete. Il client usa solo le interfacce e la factory, senza conoscere i dettagli interni della creazione.</w:t>
+      </w:r>
+    </w:p>
+    <w:p>
+      <w:r>
+        <w:t>Gli attori del pattern sono:</w:t>
+      </w:r>
+    </w:p>
+    <w:p>
+      <w:pPr>
+        <w:pStyle w:val="Paragrafoelenco"/>
+        <w:numPr>
+          <w:ilvl w:val="0"/>
+          <w:numId w:val="1"/>
+        </w:numPr>
       </w:pPr>
       <w:r>
         <w:rPr>
           <w:b/>
           <w:bCs/>
         </w:rPr>
-        <w:t>Implementazione</w:t>
-      </w:r>
-    </w:p>
-    <w:p>
-      <w:r>
-        <w:t xml:space="preserve">Il codice è strutturato con due interfacce prodotto, due coppie di classi concrete e una </w:t>
-      </w:r>
-      <w:proofErr w:type="spellStart"/>
-      <w:r>
-        <w:t>factory</w:t>
-      </w:r>
-      <w:proofErr w:type="spellEnd"/>
-      <w:r>
-        <w:t xml:space="preserve"> astratta con due implementazioni concrete. Il client usa solo le interfacce e la </w:t>
-      </w:r>
-      <w:proofErr w:type="spellStart"/>
-      <w:r>
-        <w:t>factory</w:t>
-      </w:r>
-      <w:proofErr w:type="spellEnd"/>
-      <w:r>
-        <w:t>, senza conoscere i dettagli interni della creazione.</w:t>
-      </w:r>
-    </w:p>
-    <w:p>
+        <w:t>AbstractFactory</w:t>
+      </w:r>
+    </w:p>
+    <w:p>
+      <w:pPr>
+        <w:pStyle w:val="Paragrafoelenco"/>
+        <w:numPr>
+          <w:ilvl w:val="0"/>
+          <w:numId w:val="1"/>
+        </w:numPr>
+      </w:pPr>
       <w:r>
         <w:rPr>
           <w:b/>
           <w:bCs/>
         </w:rPr>
+        <w:t>ConcreteFactory</w:t>
+      </w:r>
+    </w:p>
+    <w:p>
+      <w:pPr>
+        <w:pStyle w:val="Paragrafoelenco"/>
+        <w:numPr>
+          <w:ilvl w:val="0"/>
+          <w:numId w:val="1"/>
+        </w:numPr>
+      </w:pPr>
+      <w:r>
+        <w:rPr>
+          <w:b/>
+          <w:bCs/>
+        </w:rPr>
+        <w:t>Product</w:t>
+      </w:r>
+    </w:p>
+    <w:p>
+      <w:pPr>
+        <w:pStyle w:val="Paragrafoelenco"/>
+        <w:numPr>
+          <w:ilvl w:val="0"/>
+          <w:numId w:val="1"/>
+        </w:numPr>
+      </w:pPr>
+      <w:r>
+        <w:rPr>
+          <w:b/>
+          <w:bCs/>
+        </w:rPr>
+        <w:t>ConcreteProduct</w:t>
+      </w:r>
+    </w:p>
+    <w:p>
+      <w:r>
+        <w:rPr>
+          <w:b/>
+          <w:bCs/>
+        </w:rPr>
         <w:t>Ruoli delle classi</w:t>
       </w:r>
     </w:p>
     <w:p>
-      <w:proofErr w:type="spellStart"/>
-      <w:r>
-        <w:t>NotificationFactory</w:t>
-      </w:r>
-      <w:proofErr w:type="spellEnd"/>
-      <w:r>
-        <w:t xml:space="preserve"> è l’Abstract </w:t>
-      </w:r>
-      <w:proofErr w:type="spellStart"/>
-      <w:r>
-        <w:t>Factory</w:t>
-      </w:r>
-      <w:proofErr w:type="spellEnd"/>
+      <w:r>
+        <w:t xml:space="preserve">NotificationFactory è </w:t>
+      </w:r>
+      <w:r>
+        <w:rPr>
+          <w:b/>
+          <w:bCs/>
+        </w:rPr>
+        <w:t>l’Abstract Factory</w:t>
+      </w:r>
       <w:r>
         <w:t xml:space="preserve"> e dichiara i metodi di creazione.</w:t>
       </w:r>
     </w:p>
     <w:p>
       <w:r>
+        <w:rPr>
+          <w:noProof/>
+        </w:rPr>
         <w:drawing>
           <wp:inline distT="0" distB="0" distL="0" distR="0" wp14:anchorId="41984453" wp14:editId="725C9406">
             <wp:extent cx="6645910" cy="472440"/>
@@ -177,7 +187,7 @@
                     <pic:cNvPicPr/>
                   </pic:nvPicPr>
                   <pic:blipFill>
-                    <a:blip r:embed="rId4"/>
+                    <a:blip r:embed="rId5"/>
                     <a:stretch>
                       <a:fillRect/>
                     </a:stretch>
@@ -208,60 +218,33 @@
         <w:rPr>
           <w:lang w:val="en-US"/>
         </w:rPr>
+        <w:t xml:space="preserve"> EmailFactory e SmsFactory sono le </w:t>
+      </w:r>
+      <w:r>
+        <w:rPr>
+          <w:b/>
+          <w:bCs/>
+          <w:lang w:val="en-US"/>
+        </w:rPr>
+        <w:t>Concrete Factory.</w:t>
+      </w:r>
+      <w:r>
+        <w:rPr>
+          <w:lang w:val="en-US"/>
+        </w:rPr>
         <w:t xml:space="preserve"> </w:t>
       </w:r>
-      <w:proofErr w:type="spellStart"/>
-      <w:r>
+    </w:p>
+    <w:p>
+      <w:pPr>
+        <w:spacing w:after="0"/>
         <w:rPr>
           <w:lang w:val="en-US"/>
         </w:rPr>
-        <w:t>EmailFactory</w:t>
-      </w:r>
-      <w:proofErr w:type="spellEnd"/>
-      <w:r>
-        <w:rPr>
-          <w:lang w:val="en-US"/>
-        </w:rPr>
-        <w:t xml:space="preserve"> e </w:t>
-      </w:r>
-      <w:proofErr w:type="spellStart"/>
-      <w:r>
-        <w:rPr>
-          <w:lang w:val="en-US"/>
-        </w:rPr>
-        <w:t>SmsFactory</w:t>
-      </w:r>
-      <w:proofErr w:type="spellEnd"/>
-      <w:r>
-        <w:rPr>
-          <w:lang w:val="en-US"/>
-        </w:rPr>
-        <w:t xml:space="preserve"> </w:t>
-      </w:r>
-      <w:proofErr w:type="spellStart"/>
-      <w:r>
-        <w:rPr>
-          <w:lang w:val="en-US"/>
-        </w:rPr>
-        <w:t>sono</w:t>
-      </w:r>
-      <w:proofErr w:type="spellEnd"/>
-      <w:r>
-        <w:rPr>
-          <w:lang w:val="en-US"/>
-        </w:rPr>
-        <w:t xml:space="preserve"> le Concrete Factory. </w:t>
-      </w:r>
-    </w:p>
-    <w:p>
-      <w:pPr>
-        <w:spacing w:after="0"/>
-        <w:rPr>
-          <w:lang w:val="en-US"/>
-        </w:rPr>
-      </w:pPr>
-      <w:r>
-        <w:rPr>
+      </w:pPr>
+      <w:r>
+        <w:rPr>
+          <w:noProof/>
           <w:lang w:val="en-US"/>
         </w:rPr>
         <w:drawing>
@@ -280,7 +263,7 @@
                     <pic:cNvPicPr/>
                   </pic:nvPicPr>
                   <pic:blipFill>
-                    <a:blip r:embed="rId5"/>
+                    <a:blip r:embed="rId6"/>
                     <a:stretch>
                       <a:fillRect/>
                     </a:stretch>
@@ -309,6 +292,7 @@
       </w:pPr>
       <w:r>
         <w:rPr>
+          <w:noProof/>
           <w:lang w:val="en-US"/>
         </w:rPr>
         <w:drawing>
@@ -327,7 +311,7 @@
                     <pic:cNvPicPr/>
                   </pic:nvPicPr>
                   <pic:blipFill>
-                    <a:blip r:embed="rId6"/>
+                    <a:blip r:embed="rId7"/>
                     <a:stretch>
                       <a:fillRect/>
                     </a:stretch>
@@ -350,15 +334,14 @@
     </w:p>
     <w:p>
       <w:r>
-        <w:t xml:space="preserve">Notifica e </w:t>
-      </w:r>
-      <w:proofErr w:type="spellStart"/>
-      <w:r>
-        <w:t>TemplateMessaggio</w:t>
-      </w:r>
-      <w:proofErr w:type="spellEnd"/>
-      <w:r>
-        <w:t xml:space="preserve"> sono gli Abstract Product.</w:t>
+        <w:t xml:space="preserve">Notifica e TemplateMessaggio sono gli </w:t>
+      </w:r>
+      <w:r>
+        <w:rPr>
+          <w:b/>
+          <w:bCs/>
+        </w:rPr>
+        <w:t>Abstract Product.</w:t>
       </w:r>
     </w:p>
     <w:p>
@@ -366,6 +349,10 @@
         <w:spacing w:after="0"/>
       </w:pPr>
       <w:r>
+        <w:rPr>
+          <w:noProof/>
+        </w:rPr>
+        <w:lastRenderedPageBreak/>
         <w:drawing>
           <wp:inline distT="0" distB="0" distL="0" distR="0" wp14:anchorId="1A3C8291" wp14:editId="1E69A442">
             <wp:extent cx="6617040" cy="419122"/>
@@ -382,7 +369,7 @@
                     <pic:cNvPicPr/>
                   </pic:nvPicPr>
                   <pic:blipFill>
-                    <a:blip r:embed="rId7"/>
+                    <a:blip r:embed="rId8"/>
                     <a:stretch>
                       <a:fillRect/>
                     </a:stretch>
@@ -408,6 +395,9 @@
         <w:spacing w:after="0"/>
       </w:pPr>
       <w:r>
+        <w:rPr>
+          <w:noProof/>
+        </w:rPr>
         <w:drawing>
           <wp:inline distT="0" distB="0" distL="0" distR="0" wp14:anchorId="1A99ACE3" wp14:editId="4D47DA91">
             <wp:extent cx="6645910" cy="318135"/>
@@ -424,7 +414,7 @@
                     <pic:cNvPicPr/>
                   </pic:nvPicPr>
                   <pic:blipFill>
-                    <a:blip r:embed="rId8"/>
+                    <a:blip r:embed="rId9"/>
                     <a:stretch>
                       <a:fillRect/>
                     </a:stretch>
@@ -446,40 +436,21 @@
       </w:r>
     </w:p>
     <w:p>
-      <w:r>
-        <w:t xml:space="preserve"> </w:t>
-      </w:r>
-      <w:proofErr w:type="spellStart"/>
-      <w:r>
-        <w:t>EmailNotifica</w:t>
-      </w:r>
-      <w:proofErr w:type="spellEnd"/>
-      <w:r>
-        <w:t xml:space="preserve">, </w:t>
-      </w:r>
-      <w:proofErr w:type="spellStart"/>
-      <w:r>
-        <w:t>SmsNotifica</w:t>
-      </w:r>
-      <w:proofErr w:type="spellEnd"/>
-      <w:r>
-        <w:t xml:space="preserve">, </w:t>
-      </w:r>
-      <w:proofErr w:type="spellStart"/>
-      <w:r>
-        <w:t>EmailTemplate</w:t>
-      </w:r>
-      <w:proofErr w:type="spellEnd"/>
-      <w:r>
-        <w:t xml:space="preserve"> e </w:t>
-      </w:r>
-      <w:proofErr w:type="spellStart"/>
-      <w:r>
-        <w:t>SmsTemplate</w:t>
-      </w:r>
-      <w:proofErr w:type="spellEnd"/>
-      <w:r>
-        <w:t xml:space="preserve"> sono i Concrete Product.</w:t>
+      <w:pPr>
+        <w:rPr>
+          <w:b/>
+          <w:bCs/>
+        </w:rPr>
+      </w:pPr>
+      <w:r>
+        <w:t xml:space="preserve"> EmailNotifica, SmsNotifica, EmailTemplate e SmsTemplate sono i </w:t>
+      </w:r>
+      <w:r>
+        <w:rPr>
+          <w:b/>
+          <w:bCs/>
+        </w:rPr>
+        <w:t>Concrete Product.</w:t>
       </w:r>
     </w:p>
     <w:p>
@@ -487,7 +458,9 @@
         <w:spacing w:after="0"/>
       </w:pPr>
       <w:r>
-        <w:lastRenderedPageBreak/>
+        <w:rPr>
+          <w:noProof/>
+        </w:rPr>
         <w:drawing>
           <wp:inline distT="0" distB="0" distL="0" distR="0" wp14:anchorId="18572987" wp14:editId="62E0CE0C">
             <wp:extent cx="6597989" cy="876345"/>
@@ -504,7 +477,7 @@
                     <pic:cNvPicPr/>
                   </pic:nvPicPr>
                   <pic:blipFill>
-                    <a:blip r:embed="rId9"/>
+                    <a:blip r:embed="rId10"/>
                     <a:stretch>
                       <a:fillRect/>
                     </a:stretch>
@@ -530,6 +503,9 @@
         <w:spacing w:after="0"/>
       </w:pPr>
       <w:r>
+        <w:rPr>
+          <w:noProof/>
+        </w:rPr>
         <w:drawing>
           <wp:inline distT="0" distB="0" distL="0" distR="0" wp14:anchorId="4B09C116" wp14:editId="50414D9F">
             <wp:extent cx="6343976" cy="895396"/>
@@ -546,7 +522,7 @@
                     <pic:cNvPicPr/>
                   </pic:nvPicPr>
                   <pic:blipFill>
-                    <a:blip r:embed="rId10"/>
+                    <a:blip r:embed="rId11"/>
                     <a:stretch>
                       <a:fillRect/>
                     </a:stretch>
@@ -572,6 +548,9 @@
         <w:spacing w:after="0"/>
       </w:pPr>
       <w:r>
+        <w:rPr>
+          <w:noProof/>
+        </w:rPr>
         <w:drawing>
           <wp:inline distT="0" distB="0" distL="0" distR="0" wp14:anchorId="717A75C6" wp14:editId="511E49EB">
             <wp:extent cx="6645910" cy="866775"/>
@@ -588,7 +567,7 @@
                     <pic:cNvPicPr/>
                   </pic:nvPicPr>
                   <pic:blipFill>
-                    <a:blip r:embed="rId11"/>
+                    <a:blip r:embed="rId12"/>
                     <a:stretch>
                       <a:fillRect/>
                     </a:stretch>
@@ -614,6 +593,9 @@
         <w:spacing w:after="0"/>
       </w:pPr>
       <w:r>
+        <w:rPr>
+          <w:noProof/>
+        </w:rPr>
         <w:drawing>
           <wp:inline distT="0" distB="0" distL="0" distR="0" wp14:anchorId="3283C99F" wp14:editId="04DA9FB9">
             <wp:extent cx="6559887" cy="997001"/>
@@ -630,7 +612,7 @@
                     <pic:cNvPicPr/>
                   </pic:nvPicPr>
                   <pic:blipFill>
-                    <a:blip r:embed="rId12"/>
+                    <a:blip r:embed="rId13"/>
                     <a:stretch>
                       <a:fillRect/>
                     </a:stretch>
@@ -662,63 +644,10 @@
     </w:p>
     <w:p>
       <w:r>
-        <w:t xml:space="preserve">Se il client usa </w:t>
-      </w:r>
-      <w:proofErr w:type="spellStart"/>
-      <w:r>
-        <w:t>EmailFactory</w:t>
-      </w:r>
-      <w:proofErr w:type="spellEnd"/>
-      <w:r>
-        <w:t xml:space="preserve">, ottiene </w:t>
-      </w:r>
-      <w:proofErr w:type="spellStart"/>
-      <w:r>
-        <w:t>EmailNotifica</w:t>
-      </w:r>
-      <w:proofErr w:type="spellEnd"/>
-      <w:r>
-        <w:t xml:space="preserve"> e </w:t>
-      </w:r>
-      <w:proofErr w:type="spellStart"/>
-      <w:r>
-        <w:t>EmailTemplate</w:t>
-      </w:r>
-      <w:proofErr w:type="spellEnd"/>
-      <w:r>
-        <w:t xml:space="preserve">. Se usa </w:t>
-      </w:r>
-      <w:proofErr w:type="spellStart"/>
-      <w:r>
-        <w:t>SmsFactory</w:t>
-      </w:r>
-      <w:proofErr w:type="spellEnd"/>
-      <w:r>
-        <w:t xml:space="preserve">, ottiene </w:t>
-      </w:r>
-      <w:proofErr w:type="spellStart"/>
-      <w:r>
-        <w:t>SmsNotifica</w:t>
-      </w:r>
-      <w:proofErr w:type="spellEnd"/>
-      <w:r>
-        <w:t xml:space="preserve"> e </w:t>
-      </w:r>
-      <w:proofErr w:type="spellStart"/>
-      <w:r>
-        <w:t>SmsTemplate</w:t>
-      </w:r>
-      <w:proofErr w:type="spellEnd"/>
-      <w:r>
-        <w:t xml:space="preserve">. Tutti i prodotti restituiti dalla stessa </w:t>
-      </w:r>
-      <w:proofErr w:type="spellStart"/>
-      <w:r>
-        <w:t>factory</w:t>
-      </w:r>
-      <w:proofErr w:type="spellEnd"/>
-      <w:r>
-        <w:t xml:space="preserve"> appartengono alla stessa famiglia e sono compatibili tra loro.</w:t>
+        <w:t>Se il client usa EmailFactory, ottiene EmailNotifica e EmailTemplate. Se usa SmsFactory, ottiene SmsNotifica e SmsTemplate</w:t>
+      </w:r>
+      <w:r>
+        <w:t>.</w:t>
       </w:r>
     </w:p>
     <w:p>
@@ -726,6 +655,9 @@
         <w:spacing w:after="0"/>
       </w:pPr>
       <w:r>
+        <w:rPr>
+          <w:noProof/>
+        </w:rPr>
         <w:drawing>
           <wp:inline distT="0" distB="0" distL="0" distR="0" wp14:anchorId="45295F5C" wp14:editId="5F3C25CF">
             <wp:extent cx="5112013" cy="1619333"/>
@@ -742,7 +674,7 @@
                     <pic:cNvPicPr/>
                   </pic:nvPicPr>
                   <pic:blipFill>
-                    <a:blip r:embed="rId13"/>
+                    <a:blip r:embed="rId14"/>
                     <a:stretch>
                       <a:fillRect/>
                     </a:stretch>
@@ -768,6 +700,9 @@
         <w:spacing w:after="0"/>
       </w:pPr>
       <w:r>
+        <w:rPr>
+          <w:noProof/>
+        </w:rPr>
         <w:drawing>
           <wp:inline distT="0" distB="0" distL="0" distR="0" wp14:anchorId="36347F48" wp14:editId="1703BC22">
             <wp:extent cx="1778091" cy="323867"/>
@@ -784,7 +719,7 @@
                     <pic:cNvPicPr/>
                   </pic:nvPicPr>
                   <pic:blipFill>
-                    <a:blip r:embed="rId14"/>
+                    <a:blip r:embed="rId15"/>
                     <a:stretch>
                       <a:fillRect/>
                     </a:stretch>
@@ -840,59 +775,52 @@
           <w:b/>
           <w:bCs/>
         </w:rPr>
-        <w:t xml:space="preserve">Confronto con </w:t>
-      </w:r>
-      <w:proofErr w:type="spellStart"/>
+        <w:t>Confronto con Factory Method</w:t>
+      </w:r>
+    </w:p>
+    <w:p>
+      <w:pPr>
+        <w:spacing w:after="120"/>
+      </w:pPr>
+      <w:r>
+        <w:t>Il Factory Method crea un solo prodotto alla volta e lascia alle sottoclassi la scelta del tipo concreto. L’Abstract Factory invece crea un insieme di prodotti correlati, cioè una vera e propria famiglia di oggetti coerenti.</w:t>
+      </w:r>
+    </w:p>
+    <w:p>
+      <w:pPr>
+        <w:spacing w:after="0"/>
+      </w:pPr>
       <w:r>
         <w:rPr>
           <w:b/>
           <w:bCs/>
         </w:rPr>
-        <w:t>Factory</w:t>
-      </w:r>
-      <w:proofErr w:type="spellEnd"/>
-      <w:r>
+        <w:lastRenderedPageBreak/>
+        <w:t>Conclusione</w:t>
+      </w:r>
+    </w:p>
+    <w:p>
+      <w:pPr>
+        <w:spacing w:after="0"/>
+      </w:pPr>
+      <w:r>
+        <w:t>L’Abstract Factory è il pattern giusto quando hai bisogno di famiglie di oggetti da creare in modo coordinato. Nel nostro esempio, la scelta della factory determina tutto il resto: tipo di notifica e formato del messaggio.</w:t>
+      </w:r>
+    </w:p>
+    <w:p>
+      <w:pPr>
+        <w:spacing w:after="0"/>
         <w:rPr>
           <w:b/>
           <w:bCs/>
         </w:rPr>
-        <w:t xml:space="preserve"> Method</w:t>
-      </w:r>
-    </w:p>
-    <w:p>
-      <w:pPr>
-        <w:spacing w:after="120"/>
-      </w:pPr>
-      <w:r>
-        <w:t xml:space="preserve">Il </w:t>
-      </w:r>
-      <w:proofErr w:type="spellStart"/>
-      <w:r>
-        <w:t>Factory</w:t>
-      </w:r>
-      <w:proofErr w:type="spellEnd"/>
-      <w:r>
-        <w:t xml:space="preserve"> Method crea un solo prodotto alla volta e lascia alle sottoclassi la scelta del tipo concreto. L’Abstract </w:t>
-      </w:r>
-      <w:proofErr w:type="spellStart"/>
-      <w:r>
-        <w:t>Factory</w:t>
-      </w:r>
-      <w:proofErr w:type="spellEnd"/>
-      <w:r>
-        <w:t xml:space="preserve"> invece crea un insieme di prodotti correlati, cioè una vera e propria famiglia di oggetti coerenti.</w:t>
-      </w:r>
-    </w:p>
-    <w:p>
-      <w:pPr>
-        <w:spacing w:after="0"/>
       </w:pPr>
       <w:r>
         <w:rPr>
           <w:b/>
           <w:bCs/>
         </w:rPr>
-        <w:t>Conclusione</w:t>
+        <w:t>DIAGRAMMA UML</w:t>
       </w:r>
     </w:p>
     <w:p>
@@ -900,26 +828,57 @@
         <w:spacing w:after="0"/>
       </w:pPr>
       <w:r>
-        <w:t xml:space="preserve">L’Abstract </w:t>
-      </w:r>
-      <w:proofErr w:type="spellStart"/>
-      <w:r>
-        <w:t>Factory</w:t>
-      </w:r>
-      <w:proofErr w:type="spellEnd"/>
-      <w:r>
-        <w:t xml:space="preserve"> è il pattern giusto quando hai bisogno di famiglie di oggetti da creare in modo coordinato. Nel nostro esempio, la scelta della </w:t>
-      </w:r>
-      <w:proofErr w:type="spellStart"/>
-      <w:r>
-        <w:t>factory</w:t>
-      </w:r>
-      <w:proofErr w:type="spellEnd"/>
-      <w:r>
-        <w:t xml:space="preserve"> determina tutto il resto: tipo di notifica e formato del messaggio.</w:t>
-      </w:r>
-    </w:p>
-    <w:p/>
+        <w:rPr>
+          <w:b/>
+          <w:bCs/>
+          <w:noProof/>
+        </w:rPr>
+        <w:drawing>
+          <wp:inline distT="0" distB="0" distL="0" distR="0" wp14:anchorId="2F8B96C7" wp14:editId="4CC68DF8">
+            <wp:extent cx="6645910" cy="3844290"/>
+            <wp:effectExtent l="0" t="0" r="2540" b="3810"/>
+            <wp:docPr id="1859989514" name="Immagine 1"/>
+            <wp:cNvGraphicFramePr>
+              <a:graphicFrameLocks xmlns:a="http://schemas.openxmlformats.org/drawingml/2006/main" noChangeAspect="1"/>
+            </wp:cNvGraphicFramePr>
+            <a:graphic xmlns:a="http://schemas.openxmlformats.org/drawingml/2006/main">
+              <a:graphicData uri="http://schemas.openxmlformats.org/drawingml/2006/picture">
+                <pic:pic xmlns:pic="http://schemas.openxmlformats.org/drawingml/2006/picture">
+                  <pic:nvPicPr>
+                    <pic:cNvPr id="1859989514" name="Immagine 1859989514"/>
+                    <pic:cNvPicPr/>
+                  </pic:nvPicPr>
+                  <pic:blipFill>
+                    <a:blip r:embed="rId16">
+                      <a:extLst>
+                        <a:ext uri="{28A0092B-C50C-407E-A947-70E740481C1C}">
+                          <a14:useLocalDpi xmlns:a14="http://schemas.microsoft.com/office/drawing/2010/main" val="0"/>
+                        </a:ext>
+                      </a:extLst>
+                    </a:blip>
+                    <a:stretch>
+                      <a:fillRect/>
+                    </a:stretch>
+                  </pic:blipFill>
+                  <pic:spPr>
+                    <a:xfrm>
+                      <a:off x="0" y="0"/>
+                      <a:ext cx="6645910" cy="3844290"/>
+                    </a:xfrm>
+                    <a:prstGeom prst="rect">
+                      <a:avLst/>
+                    </a:prstGeom>
+                  </pic:spPr>
+                </pic:pic>
+              </a:graphicData>
+            </a:graphic>
+          </wp:inline>
+        </w:drawing>
+      </w:r>
+      <w:r>
+        <w:t>Si nota da subito come la struttura annidata renda difficile introdurre u nuovo abstractProduct poiché l’aggiunta anche di una sola riga nella classe Notification Factory si propaga nelle classi figlie. Questo pattern però promuove la coerenza nell’utilizzo dei prodotti, consente di cambiare in modo semplice la famiglia di prodotti che sto utilizzando cambiando soltanto il tipo di factory che utilizzo nella creazione. I clienti sono indipendenti dalle classi concrete poiché utilizzano soltanto i metodi offerti dall’interfaccia del prodotto concreto.</w:t>
+      </w:r>
+    </w:p>
     <w:sectPr>
       <w:pgSz w:w="11906" w:h="16838"/>
       <w:pgMar w:top="720" w:right="720" w:bottom="720" w:left="720" w:header="708" w:footer="708" w:gutter="0"/>
@@ -928,6 +887,100 @@
     </w:sectPr>
   </w:body>
 </w:document>
+</file>
+
+<file path=word/numbering.xml><?xml version="1.0" encoding="utf-8"?>
+<w:numbering xmlns:wpc="http://schemas.microsoft.com/office/word/2010/wordprocessingCanvas" xmlns:cx="http://schemas.microsoft.com/office/drawing/2014/chartex" xmlns:cx1="http://schemas.microsoft.com/office/drawing/2015/9/8/chartex" xmlns:cx2="http://schemas.microsoft.com/office/drawing/2015/10/21/chartex" xmlns:cx3="http://schemas.microsoft.com/office/drawing/2016/5/9/chartex" xmlns:cx4="http://schemas.microsoft.com/office/drawing/2016/5/10/chartex" xmlns:cx5="http://schemas.microsoft.com/office/drawing/2016/5/11/chartex" xmlns:cx6="http://schemas.microsoft.com/office/drawing/2016/5/12/chartex" xmlns:cx7="http://schemas.microsoft.com/office/drawing/2016/5/13/chartex" xmlns:cx8="http://schemas.microsoft.com/office/drawing/2016/5/14/chartex" xmlns:mc="http://schemas.openxmlformats.org/markup-compatibility/2006" xmlns:aink="http://schemas.microsoft.com/office/drawing/2016/ink" xmlns:am3d="http://schemas.microsoft.com/office/drawing/2017/model3d" xmlns:o="urn:schemas-microsoft-com:office:office" xmlns:oel="http://schemas.microsoft.com/office/2019/extlst" xmlns:r="http://schemas.openxmlformats.org/officeDocument/2006/relationships" xmlns:m="http://schemas.openxmlformats.org/officeDocument/2006/math" xmlns:v="urn:schemas-microsoft-com:vml" xmlns:wp14="http://schemas.microsoft.com/office/word/2010/wordprocessingDrawing" xmlns:wp="http://schemas.openxmlformats.org/drawingml/2006/wordprocessingDrawing" xmlns:w10="urn:schemas-microsoft-com:office:word" xmlns:w="http://schemas.openxmlformats.org/wordprocessingml/2006/main" xmlns:w14="http://schemas.microsoft.com/office/word/2010/wordml" xmlns:w15="http://schemas.microsoft.com/office/word/2012/wordml" xmlns:w16cex="http://schemas.microsoft.com/office/word/2018/wordml/cex" xmlns:w16cid="http://schemas.microsoft.com/office/word/2016/wordml/cid" xmlns:w16="http://schemas.microsoft.com/office/word/2018/wordml" xmlns:w16du="http://schemas.microsoft.com/office/word/2023/wordml/word16du" xmlns:w16sdtdh="http://schemas.microsoft.com/office/word/2020/wordml/sdtdatahash" xmlns:w16sdtfl="http://schemas.microsoft.com/office/word/2024/wordml/sdtformatlock" xmlns:w16se="http://schemas.microsoft.com/office/word/2015/wordml/symex" xmlns:wpg="http://schemas.microsoft.com/office/word/2010/wordprocessingGroup" xmlns:wpi="http://schemas.microsoft.com/office/word/2010/wordprocessingInk" xmlns:wne="http://schemas.microsoft.com/office/word/2006/wordml" xmlns:wps="http://schemas.microsoft.com/office/word/2010/wordprocessingShape" mc:Ignorable="w14 w15 w16se w16cid w16 w16cex w16sdtdh w16sdtfl w16du wp14">
+  <w:abstractNum w:abstractNumId="0" w15:restartNumberingAfterBreak="0">
+    <w:nsid w:val="1E82116D"/>
+    <w:multiLevelType w:val="hybridMultilevel"/>
+    <w:tmpl w:val="7BC6CA78"/>
+    <w:lvl w:ilvl="0" w:tplc="04100011">
+      <w:start w:val="1"/>
+      <w:numFmt w:val="decimal"/>
+      <w:lvlText w:val="%1)"/>
+      <w:lvlJc w:val="left"/>
+      <w:pPr>
+        <w:ind w:left="720" w:hanging="360"/>
+      </w:pPr>
+    </w:lvl>
+    <w:lvl w:ilvl="1" w:tplc="04100019" w:tentative="1">
+      <w:start w:val="1"/>
+      <w:numFmt w:val="lowerLetter"/>
+      <w:lvlText w:val="%2."/>
+      <w:lvlJc w:val="left"/>
+      <w:pPr>
+        <w:ind w:left="1440" w:hanging="360"/>
+      </w:pPr>
+    </w:lvl>
+    <w:lvl w:ilvl="2" w:tplc="0410001B" w:tentative="1">
+      <w:start w:val="1"/>
+      <w:numFmt w:val="lowerRoman"/>
+      <w:lvlText w:val="%3."/>
+      <w:lvlJc w:val="right"/>
+      <w:pPr>
+        <w:ind w:left="2160" w:hanging="180"/>
+      </w:pPr>
+    </w:lvl>
+    <w:lvl w:ilvl="3" w:tplc="0410000F" w:tentative="1">
+      <w:start w:val="1"/>
+      <w:numFmt w:val="decimal"/>
+      <w:lvlText w:val="%4."/>
+      <w:lvlJc w:val="left"/>
+      <w:pPr>
+        <w:ind w:left="2880" w:hanging="360"/>
+      </w:pPr>
+    </w:lvl>
+    <w:lvl w:ilvl="4" w:tplc="04100019" w:tentative="1">
+      <w:start w:val="1"/>
+      <w:numFmt w:val="lowerLetter"/>
+      <w:lvlText w:val="%5."/>
+      <w:lvlJc w:val="left"/>
+      <w:pPr>
+        <w:ind w:left="3600" w:hanging="360"/>
+      </w:pPr>
+    </w:lvl>
+    <w:lvl w:ilvl="5" w:tplc="0410001B" w:tentative="1">
+      <w:start w:val="1"/>
+      <w:numFmt w:val="lowerRoman"/>
+      <w:lvlText w:val="%6."/>
+      <w:lvlJc w:val="right"/>
+      <w:pPr>
+        <w:ind w:left="4320" w:hanging="180"/>
+      </w:pPr>
+    </w:lvl>
+    <w:lvl w:ilvl="6" w:tplc="0410000F" w:tentative="1">
+      <w:start w:val="1"/>
+      <w:numFmt w:val="decimal"/>
+      <w:lvlText w:val="%7."/>
+      <w:lvlJc w:val="left"/>
+      <w:pPr>
+        <w:ind w:left="5040" w:hanging="360"/>
+      </w:pPr>
+    </w:lvl>
+    <w:lvl w:ilvl="7" w:tplc="04100019" w:tentative="1">
+      <w:start w:val="1"/>
+      <w:numFmt w:val="lowerLetter"/>
+      <w:lvlText w:val="%8."/>
+      <w:lvlJc w:val="left"/>
+      <w:pPr>
+        <w:ind w:left="5760" w:hanging="360"/>
+      </w:pPr>
+    </w:lvl>
+    <w:lvl w:ilvl="8" w:tplc="0410001B" w:tentative="1">
+      <w:start w:val="1"/>
+      <w:numFmt w:val="lowerRoman"/>
+      <w:lvlText w:val="%9."/>
+      <w:lvlJc w:val="right"/>
+      <w:pPr>
+        <w:ind w:left="6480" w:hanging="180"/>
+      </w:pPr>
+    </w:lvl>
+  </w:abstractNum>
+  <w:num w:numId="1" w16cid:durableId="2146240305">
+    <w:abstractNumId w:val="0"/>
+  </w:num>
+</w:numbering>
 </file>
 
 <file path=word/styles.xml><?xml version="1.0" encoding="utf-8"?>
@@ -1533,6 +1586,7 @@
   <w:style w:type="character" w:default="1" w:styleId="Carpredefinitoparagrafo">
     <w:name w:val="Default Paragraph Font"/>
     <w:uiPriority w:val="1"/>
+    <w:semiHidden/>
     <w:unhideWhenUsed/>
   </w:style>
   <w:style w:type="table" w:default="1" w:styleId="Tabellanormale">

</xml_diff>